<commit_message>
Remove the telephone number from the site and the downloadable CV
The repository is public, so the number is dropped from the hero contact
chips and the contact section, and stripped from the .docx that the site
offers for download. The original document is unchanged.

Co-Authored-By: Claude Opus 5 <noreply@anthropic.com>
</commit_message>
<xml_diff>
--- a/assets/Nilufer-Misirli-CV-2026.docx
+++ b/assets/Nilufer-Misirli-CV-2026.docx
@@ -106,25 +106,25 @@
         <w:rPr>
           <w:rFonts w:cs="Times New Roman"/>
         </w:rPr>
-        <w:t xml:space="preserve"># </w:t>
-      </w:r>
-      <w:r>
-        <w:rPr>
-          <w:rFonts w:cs="Times New Roman"/>
-        </w:rPr>
-        <w:t xml:space="preserve">+90 </w:t>
-      </w:r>
-      <w:r>
-        <w:rPr>
-          <w:rFonts w:cs="Times New Roman"/>
-        </w:rPr>
-        <w:t>53377138</w:t>
-      </w:r>
-      <w:r>
-        <w:rPr>
-          <w:rFonts w:cs="Times New Roman"/>
-        </w:rPr>
-        <w:t xml:space="preserve">90 </w:t>
+        <w:t xml:space="preserve"/>
+      </w:r>
+      <w:r>
+        <w:rPr>
+          <w:rFonts w:cs="Times New Roman"/>
+        </w:rPr>
+        <w:t xml:space="preserve"/>
+      </w:r>
+      <w:r>
+        <w:rPr>
+          <w:rFonts w:cs="Times New Roman"/>
+        </w:rPr>
+        <w:t/>
+      </w:r>
+      <w:r>
+        <w:rPr>
+          <w:rFonts w:cs="Times New Roman"/>
+        </w:rPr>
+        <w:t xml:space="preserve"/>
       </w:r>
       <w:hyperlink r:id="rId9" w:history="1">
         <w:r>

</xml_diff>